<commit_message>
docs: update all published numbers for D8 request-frequency fix
</commit_message>
<xml_diff>
--- a/DRDO_DIA-CoE_EW02_Technical_Report.docx
+++ b/DRDO_DIA-CoE_EW02_Technical_Report.docx
@@ -91,7 +91,7 @@
           <w:i w:val="0"/>
           <w:sz w:val="18"/>
         </w:rPr>
-        <w:t>High-frequency (HF) emitter geolocation from a single receiving station is limited by the ionospheric range estimate: operational direction finding yields a bearing but no range. This work closes that gap with a three-layer, real-time pipeline—a condition-aware hybrid ionospheric model selector, a two-pass single-station-location (SSL) algorithm that re-queries the ionosphere at the signal reflection point, and a per-population Gaussian-process (GP) layer that corrects the systematic SSL bias. Trained and evaluated on real ionosonde residuals from the GIRO AH223 Ahmedabad station (June, July, December 2012), the system reduces held-out test-fold mean absolute error from 103.29 km to 77.15 km (25.3%) under nominal mid-latitude conditions and from 610.80 km to 111.96 km (81.7%) under geomagnetic-storm conditions, where HF geolocation degrades most and matters most. These figures are interpolation within the training distribution, not cross-station or cross-season generalization. A ground-truth test-signal generator (an explicit deliverable) and a bearing-noise sensitivity study establish the geolocation Figure of Merit directly: with perfect bearings the SSL algorithm's median intrinsic error is 3.2 km, and elevation-bearing error dominates, costing 4–6× more than equal azimuth error and reaching a 186 km median at 2° elevation noise. The contribution is a reproducible, fully offline-capable FastAPI service built on open ionosonde data, together with an explicit validity envelope and a documented defect ledger.</w:t>
+        <w:t>High-frequency (HF) emitter geolocation from a single receiving station is limited by the ionospheric range estimate: operational direction finding yields a bearing but no range. This work closes that gap with a three-layer, real-time pipeline—a condition-aware hybrid ionospheric model selector, a two-pass single-station-location (SSL) algorithm that re-queries the ionosphere at the signal reflection point, and a per-population Gaussian-process (GP) layer that corrects the systematic SSL bias. Trained and evaluated on real ionosonde residuals from the GIRO AH223 Ahmedabad station (June, July, December 2012), the system reduces held-out test-fold mean absolute error from 103.29 km to 77.15 km (25.3%) under nominal mid-latitude conditions. Under geomagnetic-storm conditions, correcting the ray tracer to run at the request frequency (defect D8) revealed that most storm-time signals at typical HF frequencies penetrate the depleted ionosphere—correctly reported as having no skywave solution—and that the reflecting remainder carries a 405.90 km physics baseline that the 66-row storm population can only marginally correct (379.64 km, 6.5%); earlier storm figures are retracted as a physics artifact. These figures are interpolation within the training distribution, not cross-station or cross-season generalization. A ground-truth test-signal generator (an explicit deliverable) and a bearing-noise sensitivity study establish the geolocation Figure of Merit directly: with perfect bearings the SSL algorithm's median intrinsic error is 4.2 km, and elevation-bearing error dominates, costing σ-for-σ about 3× more than azimuth error and reaching a 143 km median at 2° elevation noise. The contribution is a reproducible, fully offline-capable FastAPI service built on open ionosonde data, together with an explicit validity envelope and a documented defect ledger.</w:t>
       </w:r>
     </w:p>
     <w:p>
@@ -184,7 +184,7 @@
           <w:rFonts w:ascii="Times New Roman" w:hAnsi="Times New Roman"/>
           <w:sz w:val="20"/>
         </w:rPr>
-        <w:t>The central contribution is stated plainly: during geomagnetic storms—when HF geolocation degrades most and matters most—this system reduces single-station range error from 611 km to 112 km, validated on real ionosonde data from AH223 Ahmedabad. Under nominal conditions it reduces error from 103 km to 77 km. The remainder of this paper formulates the problem (Section II), describes the architecture (Sections III–V), reports validation (Section VI), establishes the test-signal ground truth and bearing-error figure of merit (Section VII), states the validity envelope and defect ledger honestly (Section VIII), and outlines the path to operational use (Section IX).</w:t>
+        <w:t>The central contribution is stated plainly: a reproducible single-station geolocation pipeline that reduces nominal-condition range error from 103 km to 77 km on real AH223 ionosonde data, quantifies its own intrinsic accuracy with a ground-truth test-signal generator (median 4.2 km with perfect bearings), and reports its storm-time behaviour honestly: with the ray tracer corrected to run at the request frequency (defect D8), most storm-condition signals penetrate the depleted ionosphere and are flagged as having no skywave solution, while the reflecting remainder carries a ~406 km physics baseline that the present 66-row storm population cannot yet meaningfully correct. The remainder of this paper formulates the problem (Section II), describes the architecture (Sections III–V), reports validation (Section VI), establishes the test-signal ground truth and bearing-error figure of merit (Section VII), states the validity envelope and defect ledger honestly (Section VIII), and outlines the path to operational use (Section IX).</w:t>
       </w:r>
     </w:p>
     <w:p>
@@ -500,7 +500,7 @@
           <w:rFonts w:ascii="Times New Roman" w:hAnsi="Times New Roman"/>
           <w:sz w:val="20"/>
         </w:rPr>
-        <w:t>A FastAPI service exposes the pipeline. POST /locate accepts the receiver position, azimuth, elevation, frequency, timestamp, and geomagnetic indices (Kp, Dst, optional F10.7), and returns the SSL physics estimate, the GP-corrected estimate with posterior uncertainty, the model audit trail, and warning flags. GET /health confirms that all four GP model files loaded at start-up and reports the training row counts (7,382 for the IRTAM GP, 183 for the storm GP) for pre-demonstration verification. Input validation rejects out-of-range fields with HTTP 422; a null or non-positive virtual height returns HTTP 503 rather than a nonsensical location.</w:t>
+        <w:t>A FastAPI service exposes the pipeline. POST /locate accepts the receiver position, azimuth, elevation, frequency, timestamp, and geomagnetic indices (Kp, Dst, optional F10.7), and returns the SSL physics estimate, the GP-corrected estimate with posterior uncertainty, the model audit trail, and warning flags. GET /health confirms that all four GP model files loaded at start-up and reports the training row counts (7,382 for the IRTAM GP, 52 for the storm GP) for pre-demonstration verification. Input validation rejects out-of-range fields with HTTP 422; a null or non-positive virtual height returns HTTP 503 rather than a nonsensical location.</w:t>
       </w:r>
     </w:p>
     <w:p>
@@ -857,7 +857,7 @@
           <w:rFonts w:ascii="Times New Roman" w:hAnsi="Times New Roman"/>
           <w:sz w:val="20"/>
         </w:rPr>
-        <w:t>The dataset comprises 9,457 residual rows from AH223, dominated by the nominal IRTAM population with a small storm population (Table I). The 80/20 split within each population yields the train/test row counts in Table I.</w:t>
+        <w:t>The dataset comprises 9,457 residual rows from AH223, dominated by the nominal IRTAM population (Table I). Storm-condition rows were regenerated after the D8 fix with the ray tracer at each row's request frequency: 163 of the 229 storm-condition rows penetrate the disturbed ionosphere at their drawn frequency (no skywave return) and fall back to IRI, where no GP applies; the reflecting 66 form the storm GP population. The 80/20 split within each GP population yields the train/test row counts in Table I.</w:t>
       </w:r>
     </w:p>
     <w:p>
@@ -871,7 +871,7 @@
           <w:smallCaps/>
           <w:sz w:val="16"/>
         </w:rPr>
-        <w:t>Table I.  Dataset Composition and Train/Test Split</w:t>
+        <w:t>Table I.  Dataset Composition and Train/Test Split (post-D8)</w:t>
       </w:r>
     </w:p>
     <w:tbl>
@@ -892,7 +892,7 @@
       <w:tr>
         <w:tc>
           <w:tcPr>
-            <w:tcW w:type="dxa" w:w="1800"/>
+            <w:tcW w:type="dxa" w:w="2088"/>
           </w:tcPr>
           <w:p>
             <w:pPr>
@@ -911,7 +911,7 @@
         </w:tc>
         <w:tc>
           <w:tcPr>
-            <w:tcW w:type="dxa" w:w="792"/>
+            <w:tcW w:type="dxa" w:w="720"/>
           </w:tcPr>
           <w:p>
             <w:pPr>
@@ -930,7 +930,7 @@
         </w:tc>
         <w:tc>
           <w:tcPr>
-            <w:tcW w:type="dxa" w:w="792"/>
+            <w:tcW w:type="dxa" w:w="720"/>
           </w:tcPr>
           <w:p>
             <w:pPr>
@@ -949,7 +949,7 @@
         </w:tc>
         <w:tc>
           <w:tcPr>
-            <w:tcW w:type="dxa" w:w="792"/>
+            <w:tcW w:type="dxa" w:w="720"/>
           </w:tcPr>
           <w:p>
             <w:pPr>
@@ -968,7 +968,7 @@
         </w:tc>
         <w:tc>
           <w:tcPr>
-            <w:tcW w:type="dxa" w:w="720"/>
+            <w:tcW w:type="dxa" w:w="648"/>
           </w:tcPr>
           <w:p>
             <w:pPr>
@@ -989,7 +989,7 @@
       <w:tr>
         <w:tc>
           <w:tcPr>
-            <w:tcW w:type="dxa" w:w="1800"/>
+            <w:tcW w:type="dxa" w:w="2088"/>
           </w:tcPr>
           <w:p>
             <w:pPr>
@@ -1008,7 +1008,7 @@
         </w:tc>
         <w:tc>
           <w:tcPr>
-            <w:tcW w:type="dxa" w:w="792"/>
+            <w:tcW w:type="dxa" w:w="720"/>
           </w:tcPr>
           <w:p>
             <w:pPr>
@@ -1027,7 +1027,7 @@
         </w:tc>
         <w:tc>
           <w:tcPr>
-            <w:tcW w:type="dxa" w:w="792"/>
+            <w:tcW w:type="dxa" w:w="720"/>
           </w:tcPr>
           <w:p>
             <w:pPr>
@@ -1046,7 +1046,7 @@
         </w:tc>
         <w:tc>
           <w:tcPr>
-            <w:tcW w:type="dxa" w:w="792"/>
+            <w:tcW w:type="dxa" w:w="720"/>
           </w:tcPr>
           <w:p>
             <w:pPr>
@@ -1065,7 +1065,7 @@
         </w:tc>
         <w:tc>
           <w:tcPr>
-            <w:tcW w:type="dxa" w:w="720"/>
+            <w:tcW w:type="dxa" w:w="648"/>
           </w:tcPr>
           <w:p>
             <w:pPr>
@@ -1086,7 +1086,7 @@
       <w:tr>
         <w:tc>
           <w:tcPr>
-            <w:tcW w:type="dxa" w:w="1800"/>
+            <w:tcW w:type="dxa" w:w="2088"/>
           </w:tcPr>
           <w:p>
             <w:pPr>
@@ -1099,64 +1099,7 @@
                 <w:b w:val="0"/>
                 <w:sz w:val="15"/>
               </w:rPr>
-              <w:t>PyRayHF (storm)</w:t>
-            </w:r>
-          </w:p>
-        </w:tc>
-        <w:tc>
-          <w:tcPr>
-            <w:tcW w:type="dxa" w:w="792"/>
-          </w:tcPr>
-          <w:p>
-            <w:pPr>
-              <w:spacing w:before="20" w:after="20"/>
-              <w:jc w:val="center"/>
-            </w:pPr>
-            <w:r>
-              <w:rPr>
-                <w:rFonts w:ascii="Times New Roman" w:hAnsi="Times New Roman"/>
-                <w:b w:val="0"/>
-                <w:sz w:val="15"/>
-              </w:rPr>
-              <w:t>229</w:t>
-            </w:r>
-          </w:p>
-        </w:tc>
-        <w:tc>
-          <w:tcPr>
-            <w:tcW w:type="dxa" w:w="792"/>
-          </w:tcPr>
-          <w:p>
-            <w:pPr>
-              <w:spacing w:before="20" w:after="20"/>
-              <w:jc w:val="center"/>
-            </w:pPr>
-            <w:r>
-              <w:rPr>
-                <w:rFonts w:ascii="Times New Roman" w:hAnsi="Times New Roman"/>
-                <w:b w:val="0"/>
-                <w:sz w:val="15"/>
-              </w:rPr>
-              <w:t>2.4%</w:t>
-            </w:r>
-          </w:p>
-        </w:tc>
-        <w:tc>
-          <w:tcPr>
-            <w:tcW w:type="dxa" w:w="792"/>
-          </w:tcPr>
-          <w:p>
-            <w:pPr>
-              <w:spacing w:before="20" w:after="20"/>
-              <w:jc w:val="center"/>
-            </w:pPr>
-            <w:r>
-              <w:rPr>
-                <w:rFonts w:ascii="Times New Roman" w:hAnsi="Times New Roman"/>
-                <w:b w:val="0"/>
-                <w:sz w:val="15"/>
-              </w:rPr>
-              <w:t>183</w:t>
+              <w:t>PyRayHF (storm, reflecting)</w:t>
             </w:r>
           </w:p>
         </w:tc>
@@ -1175,7 +1118,64 @@
                 <w:b w:val="0"/>
                 <w:sz w:val="15"/>
               </w:rPr>
-              <w:t>46</w:t>
+              <w:t>66</w:t>
+            </w:r>
+          </w:p>
+        </w:tc>
+        <w:tc>
+          <w:tcPr>
+            <w:tcW w:type="dxa" w:w="720"/>
+          </w:tcPr>
+          <w:p>
+            <w:pPr>
+              <w:spacing w:before="20" w:after="20"/>
+              <w:jc w:val="center"/>
+            </w:pPr>
+            <w:r>
+              <w:rPr>
+                <w:rFonts w:ascii="Times New Roman" w:hAnsi="Times New Roman"/>
+                <w:b w:val="0"/>
+                <w:sz w:val="15"/>
+              </w:rPr>
+              <w:t>0.7%</w:t>
+            </w:r>
+          </w:p>
+        </w:tc>
+        <w:tc>
+          <w:tcPr>
+            <w:tcW w:type="dxa" w:w="720"/>
+          </w:tcPr>
+          <w:p>
+            <w:pPr>
+              <w:spacing w:before="20" w:after="20"/>
+              <w:jc w:val="center"/>
+            </w:pPr>
+            <w:r>
+              <w:rPr>
+                <w:rFonts w:ascii="Times New Roman" w:hAnsi="Times New Roman"/>
+                <w:b w:val="0"/>
+                <w:sz w:val="15"/>
+              </w:rPr>
+              <w:t>52</w:t>
+            </w:r>
+          </w:p>
+        </w:tc>
+        <w:tc>
+          <w:tcPr>
+            <w:tcW w:type="dxa" w:w="648"/>
+          </w:tcPr>
+          <w:p>
+            <w:pPr>
+              <w:spacing w:before="20" w:after="20"/>
+              <w:jc w:val="center"/>
+            </w:pPr>
+            <w:r>
+              <w:rPr>
+                <w:rFonts w:ascii="Times New Roman" w:hAnsi="Times New Roman"/>
+                <w:b w:val="0"/>
+                <w:sz w:val="15"/>
+              </w:rPr>
+              <w:t>14</w:t>
             </w:r>
           </w:p>
         </w:tc>
@@ -1183,7 +1183,104 @@
       <w:tr>
         <w:tc>
           <w:tcPr>
-            <w:tcW w:type="dxa" w:w="1800"/>
+            <w:tcW w:type="dxa" w:w="2088"/>
+          </w:tcPr>
+          <w:p>
+            <w:pPr>
+              <w:spacing w:before="20" w:after="20"/>
+              <w:jc w:val="left"/>
+            </w:pPr>
+            <w:r>
+              <w:rPr>
+                <w:rFonts w:ascii="Times New Roman" w:hAnsi="Times New Roman"/>
+                <w:b w:val="0"/>
+                <w:sz w:val="15"/>
+              </w:rPr>
+              <w:t>IRI (storm rows that penetrate)</w:t>
+            </w:r>
+          </w:p>
+        </w:tc>
+        <w:tc>
+          <w:tcPr>
+            <w:tcW w:type="dxa" w:w="720"/>
+          </w:tcPr>
+          <w:p>
+            <w:pPr>
+              <w:spacing w:before="20" w:after="20"/>
+              <w:jc w:val="center"/>
+            </w:pPr>
+            <w:r>
+              <w:rPr>
+                <w:rFonts w:ascii="Times New Roman" w:hAnsi="Times New Roman"/>
+                <w:b w:val="0"/>
+                <w:sz w:val="15"/>
+              </w:rPr>
+              <w:t>163</w:t>
+            </w:r>
+          </w:p>
+        </w:tc>
+        <w:tc>
+          <w:tcPr>
+            <w:tcW w:type="dxa" w:w="720"/>
+          </w:tcPr>
+          <w:p>
+            <w:pPr>
+              <w:spacing w:before="20" w:after="20"/>
+              <w:jc w:val="center"/>
+            </w:pPr>
+            <w:r>
+              <w:rPr>
+                <w:rFonts w:ascii="Times New Roman" w:hAnsi="Times New Roman"/>
+                <w:b w:val="0"/>
+                <w:sz w:val="15"/>
+              </w:rPr>
+              <w:t>1.7%</w:t>
+            </w:r>
+          </w:p>
+        </w:tc>
+        <w:tc>
+          <w:tcPr>
+            <w:tcW w:type="dxa" w:w="720"/>
+          </w:tcPr>
+          <w:p>
+            <w:pPr>
+              <w:spacing w:before="20" w:after="20"/>
+              <w:jc w:val="center"/>
+            </w:pPr>
+            <w:r>
+              <w:rPr>
+                <w:rFonts w:ascii="Times New Roman" w:hAnsi="Times New Roman"/>
+                <w:b w:val="0"/>
+                <w:sz w:val="15"/>
+              </w:rPr>
+              <w:t>—</w:t>
+            </w:r>
+          </w:p>
+        </w:tc>
+        <w:tc>
+          <w:tcPr>
+            <w:tcW w:type="dxa" w:w="648"/>
+          </w:tcPr>
+          <w:p>
+            <w:pPr>
+              <w:spacing w:before="20" w:after="20"/>
+              <w:jc w:val="center"/>
+            </w:pPr>
+            <w:r>
+              <w:rPr>
+                <w:rFonts w:ascii="Times New Roman" w:hAnsi="Times New Roman"/>
+                <w:b w:val="0"/>
+                <w:sz w:val="15"/>
+              </w:rPr>
+              <w:t>—</w:t>
+            </w:r>
+          </w:p>
+        </w:tc>
+      </w:tr>
+      <w:tr>
+        <w:tc>
+          <w:tcPr>
+            <w:tcW w:type="dxa" w:w="2088"/>
           </w:tcPr>
           <w:p>
             <w:pPr>
@@ -1202,7 +1299,7 @@
         </w:tc>
         <w:tc>
           <w:tcPr>
-            <w:tcW w:type="dxa" w:w="792"/>
+            <w:tcW w:type="dxa" w:w="720"/>
           </w:tcPr>
           <w:p>
             <w:pPr>
@@ -1221,7 +1318,7 @@
         </w:tc>
         <w:tc>
           <w:tcPr>
-            <w:tcW w:type="dxa" w:w="792"/>
+            <w:tcW w:type="dxa" w:w="720"/>
           </w:tcPr>
           <w:p>
             <w:pPr>
@@ -1240,25 +1337,6 @@
         </w:tc>
         <w:tc>
           <w:tcPr>
-            <w:tcW w:type="dxa" w:w="792"/>
-          </w:tcPr>
-          <w:p>
-            <w:pPr>
-              <w:spacing w:before="20" w:after="20"/>
-              <w:jc w:val="center"/>
-            </w:pPr>
-            <w:r>
-              <w:rPr>
-                <w:rFonts w:ascii="Times New Roman" w:hAnsi="Times New Roman"/>
-                <w:b w:val="0"/>
-                <w:sz w:val="15"/>
-              </w:rPr>
-              <w:t>7,565</w:t>
-            </w:r>
-          </w:p>
-        </w:tc>
-        <w:tc>
-          <w:tcPr>
             <w:tcW w:type="dxa" w:w="720"/>
           </w:tcPr>
           <w:p>
@@ -1272,7 +1350,26 @@
                 <w:b w:val="0"/>
                 <w:sz w:val="15"/>
               </w:rPr>
-              <w:t>1,892</w:t>
+              <w:t>7,434</w:t>
+            </w:r>
+          </w:p>
+        </w:tc>
+        <w:tc>
+          <w:tcPr>
+            <w:tcW w:type="dxa" w:w="648"/>
+          </w:tcPr>
+          <w:p>
+            <w:pPr>
+              <w:spacing w:before="20" w:after="20"/>
+              <w:jc w:val="center"/>
+            </w:pPr>
+            <w:r>
+              <w:rPr>
+                <w:rFonts w:ascii="Times New Roman" w:hAnsi="Times New Roman"/>
+                <w:b w:val="0"/>
+                <w:sz w:val="15"/>
+              </w:rPr>
+              <w:t>1,860</w:t>
             </w:r>
           </w:p>
         </w:tc>
@@ -1308,7 +1405,7 @@
           <w:smallCaps/>
           <w:sz w:val="16"/>
         </w:rPr>
-        <w:t>Table II.  Held-Out Test-Fold Performance</w:t>
+        <w:t>Table II.  Held-Out Test-Fold Performance (post-D8)</w:t>
       </w:r>
     </w:p>
     <w:tbl>
@@ -1555,7 +1652,7 @@
                 <w:b w:val="0"/>
                 <w:sz w:val="15"/>
               </w:rPr>
-              <w:t>46</w:t>
+              <w:t>14</w:t>
             </w:r>
           </w:p>
         </w:tc>
@@ -1574,7 +1671,7 @@
                 <w:b w:val="0"/>
                 <w:sz w:val="15"/>
               </w:rPr>
-              <w:t>610.80 km</w:t>
+              <w:t>405.90 km</w:t>
             </w:r>
           </w:p>
         </w:tc>
@@ -1593,7 +1690,7 @@
                 <w:b w:val="0"/>
                 <w:sz w:val="15"/>
               </w:rPr>
-              <w:t>111.96 km</w:t>
+              <w:t>379.64 km</w:t>
             </w:r>
           </w:p>
         </w:tc>
@@ -1612,7 +1709,7 @@
                 <w:b w:val="0"/>
                 <w:sz w:val="15"/>
               </w:rPr>
-              <w:t>81.7%</w:t>
+              <w:t>6.5%</w:t>
             </w:r>
           </w:p>
         </w:tc>
@@ -1673,7 +1770,7 @@
           <w:rFonts w:ascii="Times New Roman" w:hAnsi="Times New Roman"/>
           <w:sz w:val="16"/>
         </w:rPr>
-        <w:t>Fig. 3.  Baseline vs. GP-corrected MAE on held-out test folds. Storm error falls from 610.80 km to 111.96 km.</w:t>
+        <w:t>Fig. 3.  Baseline vs. GP-corrected MAE on held-out test folds (post-D8). The storm correction is marginal at the current 66-row population.</w:t>
       </w:r>
     </w:p>
     <w:p>
@@ -1687,7 +1784,7 @@
           <w:rFonts w:ascii="Times New Roman" w:hAnsi="Times New Roman"/>
           <w:sz w:val="20"/>
         </w:rPr>
-        <w:t>Under nominal mid-latitude conditions the GP removes about a quarter of the ~103 km baseline bias. Under storm conditions the baseline SSL error is large (~611 km), as expected when the F2 layer is severely disturbed; the GP reduces it to ~112 km, an 81.7% improvement. This storm result rests on only 229 total rows (183 train, 46 test) and should be read with that sample size in mind.</w:t>
+        <w:t>Under nominal mid-latitude conditions the GP removes about a quarter of the ~103 km baseline bias. The storm figures changed fundamentally with the D8 fix. Earlier reports cited a 610.80 km baseline reduced to 111.96 km (81.7%) — those figures are retracted: the ray tracer then ran at a fixed 5 MHz regardless of request frequency, and a shape misuse of the PyRayHF find_vh interface returned a per-layer quantity instead of the vertical group-refractive-index integral. The large “learnable” storm bias the old GP removed was substantially that artifact. With corrected physics the reflecting storm population's baseline is 405.90 km and the retrained GP improves it only marginally (379.64 km, 6.5%): at 52 training rows the longitude kernel collapses and the posterior uncertainty is large. This result rests on 14 test rows and should be read accordingly.</w:t>
       </w:r>
     </w:p>
     <w:p>
@@ -1799,7 +1896,7 @@
           <w:rFonts w:ascii="Times New Roman" w:hAnsi="Times New Roman"/>
           <w:sz w:val="20"/>
         </w:rPr>
-        <w:t>Real HF direction finders measure bearings with errors of a degree or more, and in SSL geometry the elevation angle enters through tan(Δ), so bearing error—absent from the Table II figures—is the dominant real-world error source. The study (bearing_noise_study.py) injects independent zero-mean Gaussian error into azimuth and elevation, sweeping each standard deviation over {0, 0.5, 1.0, 2.0}° (a 4×4 grid), clips noisy elevations to the 1–60° band, and runs the full two-pass ssl_locate on every noisy observation against the same hybrid ionosphere the signals were synthesised from. Ionospheric lookups are memoised on coordinates quantised to 0.1°—well below the ionosphere's native spatial resolution—so 923 real model calls served 2,304 lookups; the per-cell realization count is sized from a measured per-call latency probe (one draw per signal per cell, 72 trials per cell, 1,152 total; seed 42, fully reproducible).</w:t>
+        <w:t>Real HF direction finders measure bearings with errors of a degree or more, and in SSL geometry the elevation angle enters through tan(Δ), so bearing error—absent from the Table II figures—is the dominant real-world error source. The study (bearing_noise_study.py) injects independent zero-mean Gaussian error into azimuth and elevation, sweeping each standard deviation over {0, 0.5, 1.0, 2.0}° (a 4×4 grid), clips noisy elevations to the 1–60° band, and runs the full two-pass ssl_locate on every noisy observation against the same hybrid ionosphere the signals were synthesised from. Ionospheric lookups are memoised on coordinates quantised to 0.1°—well below the ionosphere's native spatial resolution—so 1,525 real model calls served 4,608 lookups; the per-cell realization count is sized from a measured per-call latency probe (two draws per signal per cell, 144 trials per cell, 2,304 total; seed 42, fully reproducible).</w:t>
       </w:r>
     </w:p>
     <w:p>
@@ -1963,7 +2060,7 @@
                 <w:b w:val="0"/>
                 <w:sz w:val="15"/>
               </w:rPr>
-              <w:t>87.2</w:t>
+              <w:t>48.3</w:t>
             </w:r>
           </w:p>
         </w:tc>
@@ -1982,7 +2079,7 @@
                 <w:b w:val="0"/>
                 <w:sz w:val="15"/>
               </w:rPr>
-              <w:t>205.8</w:t>
+              <w:t>97.9</w:t>
             </w:r>
           </w:p>
         </w:tc>
@@ -2001,7 +2098,7 @@
                 <w:b w:val="0"/>
                 <w:sz w:val="15"/>
               </w:rPr>
-              <w:t>207.6</w:t>
+              <w:t>164.3</w:t>
             </w:r>
           </w:p>
         </w:tc>
@@ -2020,7 +2117,7 @@
                 <w:b w:val="0"/>
                 <w:sz w:val="15"/>
               </w:rPr>
-              <w:t>409.2</w:t>
+              <w:t>298.4</w:t>
             </w:r>
           </w:p>
         </w:tc>
@@ -2060,7 +2157,7 @@
                 <w:b w:val="0"/>
                 <w:sz w:val="15"/>
               </w:rPr>
-              <w:t>94.6</w:t>
+              <w:t>48.3</w:t>
             </w:r>
           </w:p>
         </w:tc>
@@ -2079,7 +2176,7 @@
                 <w:b w:val="0"/>
                 <w:sz w:val="15"/>
               </w:rPr>
-              <w:t>164.5</w:t>
+              <w:t>94.8</w:t>
             </w:r>
           </w:p>
         </w:tc>
@@ -2098,7 +2195,7 @@
                 <w:b w:val="0"/>
                 <w:sz w:val="15"/>
               </w:rPr>
-              <w:t>267.2</w:t>
+              <w:t>150.8</w:t>
             </w:r>
           </w:p>
         </w:tc>
@@ -2117,7 +2214,7 @@
                 <w:b w:val="0"/>
                 <w:sz w:val="15"/>
               </w:rPr>
-              <w:t>377.8</w:t>
+              <w:t>325.2</w:t>
             </w:r>
           </w:p>
         </w:tc>
@@ -2157,7 +2254,7 @@
                 <w:b w:val="0"/>
                 <w:sz w:val="15"/>
               </w:rPr>
-              <w:t>102.7</w:t>
+              <w:t>63.9</w:t>
             </w:r>
           </w:p>
         </w:tc>
@@ -2176,7 +2273,7 @@
                 <w:b w:val="0"/>
                 <w:sz w:val="15"/>
               </w:rPr>
-              <w:t>158.9</w:t>
+              <w:t>95.1</w:t>
             </w:r>
           </w:p>
         </w:tc>
@@ -2195,7 +2292,7 @@
                 <w:b w:val="0"/>
                 <w:sz w:val="15"/>
               </w:rPr>
-              <w:t>224.7</w:t>
+              <w:t>155.4</w:t>
             </w:r>
           </w:p>
         </w:tc>
@@ -2214,7 +2311,7 @@
                 <w:b w:val="0"/>
                 <w:sz w:val="15"/>
               </w:rPr>
-              <w:t>549.9</w:t>
+              <w:t>241.7</w:t>
             </w:r>
           </w:p>
         </w:tc>
@@ -2254,7 +2351,7 @@
                 <w:b w:val="0"/>
                 <w:sz w:val="15"/>
               </w:rPr>
-              <w:t>122.5</w:t>
+              <w:t>69.2</w:t>
             </w:r>
           </w:p>
         </w:tc>
@@ -2273,7 +2370,7 @@
                 <w:b w:val="0"/>
                 <w:sz w:val="15"/>
               </w:rPr>
-              <w:t>216.9</w:t>
+              <w:t>106.7</w:t>
             </w:r>
           </w:p>
         </w:tc>
@@ -2292,7 +2389,7 @@
                 <w:b w:val="0"/>
                 <w:sz w:val="15"/>
               </w:rPr>
-              <w:t>247.2</w:t>
+              <w:t>151.4</w:t>
             </w:r>
           </w:p>
         </w:tc>
@@ -2311,7 +2408,7 @@
                 <w:b w:val="0"/>
                 <w:sz w:val="15"/>
               </w:rPr>
-              <w:t>576.9</w:t>
+              <w:t>306.0</w:t>
             </w:r>
           </w:p>
         </w:tc>
@@ -2372,7 +2469,7 @@
           <w:rFonts w:ascii="Times New Roman" w:hAnsi="Times New Roman"/>
           <w:sz w:val="16"/>
         </w:rPr>
-        <w:t>Fig. 4.  Median geolocation error (km) over the bearing-noise grid. The zero-noise cell is the 3.2 km intrinsic floor; error grows far faster along the elevation axis than the azimuth axis.</w:t>
+        <w:t>Fig. 4.  Median geolocation error (km) over the bearing-noise grid (post-D8). The zero-noise cell is the 4.2 km intrinsic floor; error grows far faster along the elevation axis than the azimuth axis.</w:t>
       </w:r>
     </w:p>
     <w:p>
@@ -2386,7 +2483,7 @@
           <w:rFonts w:ascii="Times New Roman" w:hAnsi="Times New Roman"/>
           <w:sz w:val="20"/>
         </w:rPr>
-        <w:t>Three results stand out. First, the intrinsic floor: with perfect bearings the algorithm's median error is 3.2 km (P90 49 km). Under quiet conditions the floor is excellent—sub-kilometre at 800 km range, 5–9 km at 2,200 km—so the two-pass approximation is very tight when the virtual-height field is smooth. Under the storm condition the floor is heavy-tailed (worst zero-noise trial 3,192 km): ray-traced virtual heights vary strongly with position, the pass-one height at the receiver mislocates the bounce midpoint, and the residual height difference is amplified by 1/tan(Δ) ≈ 10–18× at the 3–8° elevations of long-range signals. This tail, not typical behaviour, is why the zero-noise MAE (87.2 km) sits far above its median.</w:t>
+        <w:t>Three results stand out. First, the intrinsic floor: with perfect bearings the algorithm's median error is 4.2 km (P90 92 km). Under quiet conditions the two-pass approximation is very tight when the virtual-height field is smooth. Under the storm condition the floor remains heavy-tailed (worst zero-noise trial 678 km): the corrected 10 MHz ray-traced heights vary strongly with position, the pass-one height at the receiver mislocates the bounce midpoint, and the residual height difference is amplified by 1/tan(Δ). This tail, not typical behaviour, is why the zero-noise MAE (48.3 km) sits far above its median.</w:t>
       </w:r>
     </w:p>
     <w:p>
@@ -2400,7 +2497,7 @@
           <w:rFonts w:ascii="Times New Roman" w:hAnsi="Times New Roman"/>
           <w:sz w:val="20"/>
         </w:rPr>
-        <w:t>Second, elevation error dominates, as the geometry predicts: at equal σ it costs 4–6× more than azimuth error (median 186.2 km for 2.0° elevation noise alone versus 44.5 km for 2.0° azimuth noise alone; 116.1 versus 18.8 km at 1.0°). Draws that push low-elevation signals toward the 1° clip explode the range estimate—the largest single-trial error was 5,493 km—so low-elevation, long-range geometry is where bearing quality matters most. Third, azimuth error mainly rotates the fix: az-only medians grow gently (3.2 → 11.7 → 18.8 → 44.5 km), consistent with cross-range displacement of approximately range × sin σ.</w:t>
+        <w:t>Second, elevation error dominates, as the geometry predicts: at equal σ it costs about 3× more than azimuth error (median 143.2 km for 2.0° elevation noise alone versus 43.0 km for 2.0° azimuth noise alone; 67.4 versus 27.3 km at 1.0°). Draws that push signals toward low elevation explode the range estimate—the largest single-trial error was 6,620 km at a noisy elevation of 2.5°—so low-elevation, long-range geometry is where bearing quality matters most. Third, azimuth error mainly rotates the fix: az-only medians grow gently (4.2 → 14.4 → 27.3 → 43.0 km), consistent with cross-range displacement of approximately range × sin σ.</w:t>
       </w:r>
     </w:p>
     <w:p>
@@ -2414,7 +2511,7 @@
           <w:rFonts w:ascii="Times New Roman" w:hAnsi="Times New Roman"/>
           <w:sz w:val="20"/>
         </w:rPr>
-        <w:t>Two scope notes apply. The study isolates the algorithm: observations are synthesised and inverted with the same hybrid ionosphere, so ionospheric-model error—characterised separately in Table II—is excluded by design, and the two error sources are not conflated. And with one noise draw per signal per cell, the MAE cells rest on 72 trials and are not perfectly monotone (heavy-tailed single draws dominate means); the medians of Fig. 4, which are robust, are monotone in both axes.</w:t>
+        <w:t>Two scope notes apply. The study isolates the algorithm: observations are synthesised and inverted with the same hybrid ionosphere, so ionospheric-model error—characterised separately in Table II—is excluded by design, and the two error sources are not conflated. And with two noise draws per signal per cell, the MAE cells rest on 144 trials and are not perfectly monotone (heavy-tailed draws dominate means); the medians of Fig. 4, which are robust, are monotone in both axes.</w:t>
       </w:r>
     </w:p>
     <w:p>
@@ -3069,7 +3166,7 @@
                 <w:b w:val="0"/>
                 <w:sz w:val="14"/>
               </w:rPr>
-              <w:t>Medium</w:t>
+              <w:t>Fixed</w:t>
             </w:r>
           </w:p>
         </w:tc>
@@ -3109,7 +3206,7 @@
                 <w:b w:val="0"/>
                 <w:sz w:val="14"/>
               </w:rPr>
-              <w:t>F10.7 defaults to 130 SFU (D9)</w:t>
+              <w:t>F10.7 defaults to 130 SFU (D9) — OMNI2 auto-lookup</w:t>
             </w:r>
           </w:p>
         </w:tc>
@@ -3128,7 +3225,7 @@
                 <w:b w:val="0"/>
                 <w:sz w:val="14"/>
               </w:rPr>
-              <w:t>Low</w:t>
+              <w:t>Fixed</w:t>
             </w:r>
           </w:p>
         </w:tc>
@@ -3227,7 +3324,7 @@
                 <w:b w:val="0"/>
                 <w:sz w:val="14"/>
               </w:rPr>
-              <w:t>Storm GP trained on 183 rows</w:t>
+              <w:t>Storm GP trained on 52 rows</w:t>
             </w:r>
           </w:p>
         </w:tc>
@@ -3246,7 +3343,7 @@
                 <w:b w:val="0"/>
                 <w:sz w:val="14"/>
               </w:rPr>
-              <w:t>Medium</w:t>
+              <w:t>High</w:t>
             </w:r>
           </w:p>
         </w:tc>
@@ -3305,7 +3402,7 @@
                 <w:b w:val="0"/>
                 <w:sz w:val="14"/>
               </w:rPr>
-              <w:t>Low</w:t>
+              <w:t>Fixed</w:t>
             </w:r>
           </w:p>
         </w:tc>
@@ -3364,7 +3461,7 @@
                 <w:b w:val="0"/>
                 <w:sz w:val="14"/>
               </w:rPr>
-              <w:t>Low</w:t>
+              <w:t>Fixed</w:t>
             </w:r>
           </w:p>
         </w:tc>
@@ -3445,7 +3542,7 @@
           <w:rFonts w:ascii="Times New Roman" w:hAnsi="Times New Roman"/>
           <w:sz w:val="20"/>
         </w:rPr>
-        <w:t>Two limitations deserve emphasis. The PyRayHF ray tracer runs at a fixed internal frequency of 5.0 MHz, and the storm GP was trained at that frequency; a request at a different frequency mixes a 5 MHz physics height with a request-frequency feature, degrading the storm correction (medium severity, not yet fixed). And the storm GP's 183 training rows are a small sample for a Gaussian process: the posterior inflates quickly away from training points and cannot finely distinguish storm severities (medium severity, flagged).</w:t>
+        <w:t>One limitation deserves emphasis: the storm GP's 52 training rows are a very small sample for a Gaussian process. At this data volume the longitude kernel collapses (length scale → 0), the posterior inflates quickly away from training points, and the correction is marginal (Table II). Storm-time corrections should be treated with caution until the population is expanded — the highest-priority validation item. The frequency-consistency defect that previously compounded this (D8) is fixed: the ray tracer now runs at the request frequency, and its correction additionally exposed and resolved a find_vh interface misuse that had inflated storm baselines (see Table VI).</w:t>
       </w:r>
     </w:p>
     <w:p>
@@ -3824,7 +3921,47 @@
                 <w:b w:val="0"/>
                 <w:sz w:val="14"/>
               </w:rPr>
-              <w:t>Open (medium)</w:t>
+              <w:t>Fixed</w:t>
+            </w:r>
+          </w:p>
+        </w:tc>
+      </w:tr>
+      <w:tr>
+        <w:tc>
+          <w:tcPr>
+            <w:tcW w:type="dxa" w:w="3384"/>
+          </w:tcPr>
+          <w:p>
+            <w:pPr>
+              <w:spacing w:before="20" w:after="20"/>
+              <w:jc w:val="left"/>
+            </w:pPr>
+            <w:r>
+              <w:rPr>
+                <w:rFonts w:ascii="Times New Roman" w:hAnsi="Times New Roman"/>
+                <w:b w:val="0"/>
+                <w:sz w:val="14"/>
+              </w:rPr>
+              <w:t>find_vh shape misuse (per-layer value, not integral)</w:t>
+            </w:r>
+          </w:p>
+        </w:tc>
+        <w:tc>
+          <w:tcPr>
+            <w:tcW w:type="dxa" w:w="1512"/>
+          </w:tcPr>
+          <w:p>
+            <w:pPr>
+              <w:spacing w:before="20" w:after="20"/>
+              <w:jc w:val="center"/>
+            </w:pPr>
+            <w:r>
+              <w:rPr>
+                <w:rFonts w:ascii="Times New Roman" w:hAnsi="Times New Roman"/>
+                <w:b w:val="0"/>
+                <w:sz w:val="14"/>
+              </w:rPr>
+              <w:t>Fixed</w:t>
             </w:r>
           </w:p>
         </w:tc>
@@ -3846,7 +3983,7 @@
           <w:rFonts w:ascii="Times New Roman" w:hAnsi="Times New Roman"/>
           <w:sz w:val="20"/>
         </w:rPr>
-        <w:t>Each ledger entry was caught during engineering review and either resolved or explicitly tracked. The foF2 unit error was a thousand-fold scaling mistake in the critical-frequency formula; the null-sentinel guard converts a missing IRI hmF2 into a clean HTTP 503 instead of a 500 traceback during a live demonstration; the scikit-learn version is pinned so the serialised GP models load deterministically; and the kernel-collapse defect motivated the per-population split described in Section V. Three low-severity geometric limitations remain documented rather than fixed because they cannot fire at the AH223 23°N deployment: the two ionospheric calls could select different models if a midpoint crosses the 60° A-CHAIM latitude boundary; the midpoint longitude uses an arithmetic mean that is wrong across the ±180° antimeridian; and the A-CHAIM branch itself receives no test coverage at India geometry. Each has a known fix path and would be addressed before a polar or trans-antimeridian deployment.</w:t>
+        <w:t>Each ledger entry was caught during engineering review and either resolved or explicitly tracked. The foF2 unit error was a thousand-fold scaling mistake in the critical-frequency formula; the null-sentinel guard converts a missing IRI hmF2 into a clean HTTP 503 instead of a 500 traceback during a live demonstration; the scikit-learn version is pinned so the serialised GP models load deterministically; and the kernel-collapse defect motivated the per-population split described in Section V. The find_vh entry records that fixing D8 exposed a deeper defect: the wrapper fed per-layer arrays into an interface that integrates across layers, so the reported virtual height was a per-layer quantity rather than the group-refractive-index integral — the source of the retracted pre-D8 storm figures. The two geometric limitations formerly documented here (two-pass model mixing at the 60° boundary and antimeridian midpoint arithmetic) are now fixed via selection pinning and a circular-mean midpoint. One coverage gap remains open: the A-CHAIM branch receives no test coverage at India geometry and would be exercised before a polar deployment.</w:t>
       </w:r>
     </w:p>
     <w:p>
@@ -3888,7 +4025,7 @@
           <w:rFonts w:ascii="Times New Roman" w:hAnsi="Times New Roman"/>
           <w:sz w:val="20"/>
         </w:rPr>
-        <w:t>Several engineering paths are already scoped. The storm slot is architecturally complete behind a model-agnostic interface; integrating the SAMI3 first-principles physics model in place of the PyRayHF proxy awaits real-time data access. The ionospheric baseline can be upgraded from IRI-2016 to IRI-2020. The F10.7 solar-flux index, currently defaulting to 130 SFU, can be auto-populated per observation date via an OMNI-web lookup—the request field and validator already exist; only the fetch logic is missing. Finally, the storm GP should be retrained once PyRayHF is parameterised to run at the request frequency rather than a fixed 5 MHz.</w:t>
+        <w:t>Several engineering paths are already scoped. The storm slot is architecturally complete behind a model-agnostic interface; integrating the SAMI3 first-principles physics model in place of the PyRayHF proxy awaits real-time data access. The ionospheric baseline can be upgraded from IRI-2016 to IRI-2020. The F10.7 solar-flux index is now auto-populated per observation date via an OMNI2 lookup with a cached, offline-safe fallback to 130 SFU, and each response reports the value and source used. The most consequential open item is storm-time data volume: with the ray tracer now running at the request frequency, the reflecting storm population is 66 rows — expanding it with additional storm-time ionosonde data is the top priority before storm-time corrections can be relied upon.</w:t>
       </w:r>
     </w:p>
     <w:p>

</xml_diff>